<commit_message>
Add old report files and code
</commit_message>
<xml_diff>
--- a/outputs/2026-10-09/table1.docx
+++ b/outputs/2026-10-09/table1.docx
@@ -506,7 +506,7 @@
               <w:rPr>
                 <w:sz w:val="17"/>
               </w:rPr>
-              <w:t>2.80 (1.32-5.98)</w:t>
+              <w:t>2.80 (0.89-7.22)</w:t>
             </w:r>
           </w:p>
         </w:tc>
@@ -520,7 +520,7 @@
               <w:rPr>
                 <w:sz w:val="17"/>
               </w:rPr>
-              <w:t>SAR 6.9% (7/102)</w:t>
+              <w:t>SAR 6.9% (7/102); Wald CI 1.32-5.98</w:t>
             </w:r>
           </w:p>
         </w:tc>
@@ -566,7 +566,7 @@
               <w:rPr>
                 <w:sz w:val="17"/>
               </w:rPr>
-              <w:t>1.59 (0.99-2.55)</w:t>
+              <w:t>1.59 (0.75-3.68)</w:t>
             </w:r>
           </w:p>
         </w:tc>
@@ -580,7 +580,7 @@
               <w:rPr>
                 <w:sz w:val="17"/>
               </w:rPr>
-              <w:t>SAR 3.9% (23/591)</w:t>
+              <w:t>SAR 3.9% (23/591); Wald CI 0.99-2.55</w:t>
             </w:r>
           </w:p>
         </w:tc>
@@ -626,7 +626,7 @@
               <w:rPr>
                 <w:sz w:val="17"/>
               </w:rPr>
-              <w:t>0.66 (0.40-1.10)</w:t>
+              <w:t>0.66 (0.24-1.64)</w:t>
             </w:r>
           </w:p>
         </w:tc>
@@ -640,7 +640,7 @@
               <w:rPr>
                 <w:sz w:val="17"/>
               </w:rPr>
-              <w:t>SAR 1.6% (19/1,175)</w:t>
+              <w:t>SAR 1.6% (19/1,175); Wald CI 0.40-1.10</w:t>
             </w:r>
           </w:p>
         </w:tc>
@@ -686,7 +686,7 @@
               <w:rPr>
                 <w:sz w:val="17"/>
               </w:rPr>
-              <w:t>0.57 (0.36-0.88)</w:t>
+              <w:t>0.57 (0.27-1.31)</w:t>
             </w:r>
           </w:p>
         </w:tc>
@@ -700,7 +700,7 @@
               <w:rPr>
                 <w:sz w:val="17"/>
               </w:rPr>
-              <w:t>SAR 1.4% (28/2,018)</w:t>
+              <w:t>SAR 1.4% (28/2,018); Wald CI 0.36-0.88</w:t>
             </w:r>
           </w:p>
         </w:tc>
@@ -746,7 +746,7 @@
               <w:rPr>
                 <w:sz w:val="17"/>
               </w:rPr>
-              <w:t>0.66 (0.45-0.98)</w:t>
+              <w:t>0.66 (0.29-1.47)</w:t>
             </w:r>
           </w:p>
         </w:tc>
@@ -760,7 +760,7 @@
               <w:rPr>
                 <w:sz w:val="17"/>
               </w:rPr>
-              <w:t>SAR 1.6% (41/2,532)</w:t>
+              <w:t>SAR 1.6% (41/2,532); Wald CI 0.45-0.98</w:t>
             </w:r>
           </w:p>
         </w:tc>
@@ -1497,7 +1497,7 @@
         <w:rPr>
           <w:sz w:val="15"/>
         </w:rPr>
-        <w:t>CI: Wilson for case-level proportions; for follow-up coverage and SAR, 95% bootstrap CI resampling source cases. Risk ratios: log-normal (Wald) CI. Incubation period and serial interval: gamma distributions, posterior median and 95% credible interval, fitted with epidist accounting for daily interval censoring and right truncation (main analysis inclusion criteria; see Methods).</w:t>
+        <w:t>CI: Wilson for case-level proportions; for follow-up coverage, SAR and risk ratios, 95% bootstrap CI resampling source cases (2,000 replicates; Wilson / Wald CI in notes). Incubation period and serial interval: gamma distributions, posterior median and 95% credible interval, fitted with epidist accounting for daily interval censoring and right truncation (main analysis inclusion criteria; see Methods).</w:t>
       </w:r>
     </w:p>
     <w:sectPr>

</xml_diff>